<commit_message>
feat: add document generation samples and SQL procedures for contract and quotation reporting
</commit_message>
<xml_diff>
--- a/backend-app/samples/BBNT_Giao_Nhan_Tiec.docx
+++ b/backend-app/samples/BBNT_Giao_Nhan_Tiec.docx
@@ -1,71 +1,5 @@
 
-<file path=customXml\item1.xml><?xml version="1.0" encoding="utf-8"?>
-<s:customData xmlns="http://www.wps.cn/officeDocument/2013/wpsCustomData" xmlns:s="http://www.wps.cn/officeDocument/2013/wpsCustomData">
-  <customSectProps/>
-  <customShpExts>
-    <customShpInfo spid="_x0000_s1026" textRotate="1"/>
-  </customShpExts>
-</s:customData>
-</file>
-
-<file path=customXml\item2.xml><?xml version="1.0" encoding="utf-8"?>
-<b:Sources xmlns:b="http://schemas.openxmlformats.org/officeDocument/2006/bibliography" xmlns="http://schemas.openxmlformats.org/officeDocument/2006/bibliography" SelectedStyle="\APA.XSL" StyleName="APA"/>
-</file>
-
-<file path=customXml\itemProps1.xml><?xml version="1.0" encoding="utf-8"?>
-<ds:datastoreItem xmlns:ds="http://schemas.openxmlformats.org/officeDocument/2006/customXml" ds:itemID="{B1977F7D-205B-4081-913C-38D41E755F92}">
-  <ds:schemaRefs>
-    <ds:schemaRef ds:uri="http://www.wps.cn/officeDocument/2013/wpsCustomData"/>
-  </ds:schemaRefs>
-</ds:datastoreItem>
-</file>
-
-<file path=customXml\itemProps2.xml><?xml version="1.0" encoding="utf-8"?>
-<ds:datastoreItem xmlns:ds="http://schemas.openxmlformats.org/officeDocument/2006/customXml" ds:itemID="{8044BF1E-8A55-4C67-8D7C-874AF00BACAA}">
-  <ds:schemaRefs/>
-</ds:datastoreItem>
-</file>
-
-<file path=docProps\app.xml><?xml version="1.0" encoding="utf-8"?>
-<Properties xmlns="http://schemas.openxmlformats.org/officeDocument/2006/extended-properties" xmlns:vt="http://schemas.openxmlformats.org/officeDocument/2006/docPropsVTypes">
-  <Template>Normal</Template>
-  <Pages>1</Pages>
-  <Words>216</Words>
-  <Characters>1235</Characters>
-  <Lines>10</Lines>
-  <Paragraphs>2</Paragraphs>
-  <TotalTime>212</TotalTime>
-  <ScaleCrop>false</ScaleCrop>
-  <LinksUpToDate>false</LinksUpToDate>
-  <CharactersWithSpaces>1449</CharactersWithSpaces>
-  <Application>WPS Office_12.2.0.23202_F1E327BC-269C-435d-A152-05C5408002CA</Application>
-  <DocSecurity>0</DocSecurity>
-</Properties>
-</file>
-
-<file path=docProps\core.xml><?xml version="1.0" encoding="utf-8"?>
-<cp:coreProperties xmlns:cp="http://schemas.openxmlformats.org/package/2006/metadata/core-properties" xmlns:dc="http://purl.org/dc/elements/1.1/" xmlns:dcterms="http://purl.org/dc/terms/" xmlns:dcmitype="http://purl.org/dc/dcmitype/" xmlns:xsi="http://www.w3.org/2001/XMLSchema-instance">
-  <dcterms:created xsi:type="dcterms:W3CDTF">2019-04-24T03:37:00Z</dcterms:created>
-  <dc:creator>Mr Tuan</dc:creator>
-  <cp:lastModifiedBy>XinWei</cp:lastModifiedBy>
-  <cp:lastPrinted>2021-01-26T08:28:00Z</cp:lastPrinted>
-  <dcterms:modified xsi:type="dcterms:W3CDTF">2026-06-07T15:24:13Z</dcterms:modified>
-  <cp:revision>36</cp:revision>
-</cp:coreProperties>
-</file>
-
-<file path=docProps\custom.xml><?xml version="1.0" encoding="utf-8"?>
-<Properties xmlns="http://schemas.openxmlformats.org/officeDocument/2006/custom-properties" xmlns:vt="http://schemas.openxmlformats.org/officeDocument/2006/docPropsVTypes">
-  <property fmtid="{D5CDD505-2E9C-101B-9397-08002B2CF9AE}" pid="2" name="KSOProductBuildVer">
-    <vt:lpwstr>2057-12.2.0.23202</vt:lpwstr>
-  </property>
-  <property fmtid="{D5CDD505-2E9C-101B-9397-08002B2CF9AE}" pid="3" name="ICV">
-    <vt:lpwstr>8E01822B60474D65918D2E282AA9C4A6_12</vt:lpwstr>
-  </property>
-</Properties>
-</file>
-
-<file path=word\document.xml><?xml version="1.0" encoding="utf-8"?>
+<file path=word/document.xml><?xml version="1.0" encoding="utf-8"?>
 <w:document xmlns:wpc="http://schemas.microsoft.com/office/word/2010/wordprocessingCanvas" xmlns:mc="http://schemas.openxmlformats.org/markup-compatibility/2006" xmlns:o="urn:schemas-microsoft-com:office:office" xmlns:r="http://schemas.openxmlformats.org/officeDocument/2006/relationships" xmlns:m="http://schemas.openxmlformats.org/officeDocument/2006/math" xmlns:v="urn:schemas-microsoft-com:vml" xmlns:wp14="http://schemas.microsoft.com/office/word/2010/wordprocessingDrawing" xmlns:wp="http://schemas.openxmlformats.org/drawingml/2006/wordprocessingDrawing" xmlns:w="http://schemas.openxmlformats.org/wordprocessingml/2006/main" xmlns:w14="http://schemas.microsoft.com/office/word/2010/wordml" xmlns:w10="urn:schemas-microsoft-com:office:word" xmlns:w15="http://schemas.microsoft.com/office/word/2012/wordml" xmlns:wpg="http://schemas.microsoft.com/office/word/2010/wordprocessingGroup" xmlns:wpi="http://schemas.microsoft.com/office/word/2010/wordprocessingInk" xmlns:wne="http://schemas.microsoft.com/office/word/2006/wordml" xmlns:wps="http://schemas.microsoft.com/office/word/2010/wordprocessingShape" xmlns:wpsCustomData="http://www.wps.cn/officeDocument/2013/wpsCustomData" mc:Ignorable="w14 w15 wp14">
   <w:body>
     <w:tbl>
@@ -562,7 +496,7 @@
                 <w:sz w:val="20"/>
                 <w:szCs w:val="20"/>
               </w:rPr>
-              <w:t>Trung tâm Hội nghị Tiệc cưới Queen Plaza Kỳ Hòa</w:t>
+              <w:t>Trung tâm Hội nghị Tiệc cưới {BenATenCongTy}</w:t>
             </w:r>
           </w:p>
           <w:p>
@@ -3672,7 +3606,7 @@
 </w:document>
 </file>
 
-<file path=word\endnotes.xml><?xml version="1.0" encoding="utf-8"?>
+<file path=word/endnotes.xml><?xml version="1.0" encoding="utf-8"?>
 <w:endnotes xmlns:wpc="http://schemas.microsoft.com/office/word/2010/wordprocessingCanvas" xmlns:mc="http://schemas.openxmlformats.org/markup-compatibility/2006" xmlns:o="urn:schemas-microsoft-com:office:office" xmlns:r="http://schemas.openxmlformats.org/officeDocument/2006/relationships" xmlns:m="http://schemas.openxmlformats.org/officeDocument/2006/math" xmlns:v="urn:schemas-microsoft-com:vml" xmlns:wp14="http://schemas.microsoft.com/office/word/2010/wordprocessingDrawing" xmlns:wp="http://schemas.openxmlformats.org/drawingml/2006/wordprocessingDrawing" xmlns:w="http://schemas.openxmlformats.org/wordprocessingml/2006/main" xmlns:w14="http://schemas.microsoft.com/office/word/2010/wordml" xmlns:w15="http://schemas.microsoft.com/office/word/2012/wordml" xmlns:w10="urn:schemas-microsoft-com:office:word" xmlns:wpg="http://schemas.microsoft.com/office/word/2010/wordprocessingGroup" xmlns:wpi="http://schemas.microsoft.com/office/word/2010/wordprocessingInk" xmlns:wne="http://schemas.microsoft.com/office/word/2006/wordml" xmlns:wps="http://schemas.microsoft.com/office/word/2010/wordprocessingShape" xmlns:wpsCustomData="http://www.wps.cn/officeDocument/2013/wpsCustomData" mc:Ignorable="w14 w15 wp14">
   <w:endnote w:type="separator" w:id="0">
     <w:p>
@@ -3697,99 +3631,7 @@
 </w:endnotes>
 </file>
 
-<file path=word\fontTable.xml><?xml version="1.0" encoding="utf-8"?>
-<w:fonts xmlns:mc="http://schemas.openxmlformats.org/markup-compatibility/2006" xmlns:r="http://schemas.openxmlformats.org/officeDocument/2006/relationships" xmlns:w="http://schemas.openxmlformats.org/wordprocessingml/2006/main" xmlns:w14="http://schemas.microsoft.com/office/word/2010/wordml" mc:Ignorable="w14">
-  <w:font w:name="Times New Roman">
-    <w:panose1 w:val="02020603050405020304"/>
-    <w:charset w:val="A3"/>
-    <w:family w:val="roman"/>
-    <w:pitch w:val="default"/>
-    <w:sig w:usb0="E0002EFF" w:usb1="C000785B" w:usb2="00000009" w:usb3="00000000" w:csb0="400001FF" w:csb1="FFFF0000"/>
-  </w:font>
-  <w:font w:name="宋体">
-    <w:altName w:val="SimSun"/>
-    <w:panose1 w:val="02010600030101010101"/>
-    <w:charset w:val="86"/>
-    <w:family w:val="auto"/>
-    <w:pitch w:val="variable"/>
-    <w:sig w:usb0="00000003" w:usb1="080E0000" w:usb2="00000010" w:usb3="00000000" w:csb0="00040001" w:csb1="00000000"/>
-  </w:font>
-  <w:font w:name="SimSun">
-    <w:panose1 w:val="02010600030101010101"/>
-    <w:charset w:val="86"/>
-    <w:family w:val="auto"/>
-    <w:pitch w:val="default"/>
-    <w:sig w:usb0="00000203" w:usb1="288F0000" w:usb2="00000006" w:usb3="00000000" w:csb0="00040001" w:csb1="00000000"/>
-  </w:font>
-  <w:font w:name="Arial">
-    <w:panose1 w:val="020B0604020202020204"/>
-    <w:charset w:val="00"/>
-    <w:family w:val="swiss"/>
-    <w:pitch w:val="default"/>
-    <w:sig w:usb0="E0002EFF" w:usb1="C000785B" w:usb2="00000009" w:usb3="00000000" w:csb0="400001FF" w:csb1="FFFF0000"/>
-  </w:font>
-  <w:font w:name="黑体">
-    <w:altName w:val="SimSun"/>
-    <w:panose1 w:val="02010600030101010101"/>
-    <w:charset w:val="86"/>
-    <w:family w:val="auto"/>
-    <w:pitch w:val="default"/>
-    <w:sig w:usb0="00000001" w:usb1="080E0000" w:usb2="00000010" w:usb3="00000000" w:csb0="00040000" w:csb1="00000000"/>
-  </w:font>
-  <w:font w:name="Courier New">
-    <w:panose1 w:val="02070309020205020404"/>
-    <w:charset w:val="00"/>
-    <w:family w:val="modern"/>
-    <w:pitch w:val="default"/>
-    <w:sig w:usb0="E0002EFF" w:usb1="C0007843" w:usb2="00000009" w:usb3="00000000" w:csb0="400001FF" w:csb1="FFFF0000"/>
-  </w:font>
-  <w:font w:name="Wingdings">
-    <w:panose1 w:val="05000000000000000000"/>
-    <w:charset w:val="02"/>
-    <w:family w:val="auto"/>
-    <w:pitch w:val="default"/>
-    <w:sig w:usb0="00000000" w:usb1="00000000" w:usb2="00000000" w:usb3="00000000" w:csb0="80000000" w:csb1="00000000"/>
-  </w:font>
-  <w:font w:name="Calibri">
-    <w:panose1 w:val="020F0502020204030204"/>
-    <w:charset w:val="86"/>
-    <w:family w:val="swiss"/>
-    <w:pitch w:val="default"/>
-    <w:sig w:usb0="E4002EFF" w:usb1="C200247B" w:usb2="00000009" w:usb3="00000000" w:csb0="200001FF" w:csb1="00000000"/>
-  </w:font>
-  <w:font w:name="等线">
-    <w:altName w:val="Microsoft YaHei"/>
-    <w:panose1 w:val="00000000000000000000"/>
-    <w:charset w:val="86"/>
-    <w:family w:val="auto"/>
-    <w:pitch w:val="default"/>
-    <w:sig w:usb0="00000000" w:usb1="00000000" w:usb2="00000000" w:usb3="00000000" w:csb0="00000000" w:csb1="00000000"/>
-  </w:font>
-  <w:font w:name="Calibri">
-    <w:panose1 w:val="020F0502020204030204"/>
-    <w:charset w:val="A3"/>
-    <w:family w:val="swiss"/>
-    <w:pitch w:val="default"/>
-    <w:sig w:usb0="E4002EFF" w:usb1="C200247B" w:usb2="00000009" w:usb3="00000000" w:csb0="200001FF" w:csb1="00000000"/>
-  </w:font>
-  <w:font w:name="Calibri">
-    <w:panose1 w:val="020F0502020204030204"/>
-    <w:charset w:val="00"/>
-    <w:family w:val="auto"/>
-    <w:pitch w:val="default"/>
-    <w:sig w:usb0="E4002EFF" w:usb1="C200247B" w:usb2="00000009" w:usb3="00000000" w:csb0="200001FF" w:csb1="00000000"/>
-  </w:font>
-  <w:font w:name="Tahoma">
-    <w:panose1 w:val="020B0604030504040204"/>
-    <w:charset w:val="00"/>
-    <w:family w:val="swiss"/>
-    <w:pitch w:val="default"/>
-    <w:sig w:usb0="E1002EFF" w:usb1="C000605B" w:usb2="00000029" w:usb3="00000000" w:csb0="200101FF" w:csb1="20280000"/>
-  </w:font>
-</w:fonts>
-</file>
-
-<file path=word\footnotes.xml><?xml version="1.0" encoding="utf-8"?>
+<file path=word/footnotes.xml><?xml version="1.0" encoding="utf-8"?>
 <w:footnotes xmlns:wpc="http://schemas.microsoft.com/office/word/2010/wordprocessingCanvas" xmlns:mc="http://schemas.openxmlformats.org/markup-compatibility/2006" xmlns:o="urn:schemas-microsoft-com:office:office" xmlns:r="http://schemas.openxmlformats.org/officeDocument/2006/relationships" xmlns:m="http://schemas.openxmlformats.org/officeDocument/2006/math" xmlns:v="urn:schemas-microsoft-com:vml" xmlns:wp14="http://schemas.microsoft.com/office/word/2010/wordprocessingDrawing" xmlns:wp="http://schemas.openxmlformats.org/drawingml/2006/wordprocessingDrawing" xmlns:w="http://schemas.openxmlformats.org/wordprocessingml/2006/main" xmlns:w14="http://schemas.microsoft.com/office/word/2010/wordml" xmlns:w15="http://schemas.microsoft.com/office/word/2012/wordml" xmlns:w10="urn:schemas-microsoft-com:office:word" xmlns:wpg="http://schemas.microsoft.com/office/word/2010/wordprocessingGroup" xmlns:wpi="http://schemas.microsoft.com/office/word/2010/wordprocessingInk" xmlns:wne="http://schemas.microsoft.com/office/word/2006/wordml" xmlns:wps="http://schemas.microsoft.com/office/word/2010/wordprocessingShape" xmlns:wpsCustomData="http://www.wps.cn/officeDocument/2013/wpsCustomData" mc:Ignorable="w14 w15 wp14">
   <w:footnote w:type="separator" w:id="0">
     <w:p>
@@ -3814,219 +3656,7 @@
 </w:footnotes>
 </file>
 
-<file path=word\settings.xml><?xml version="1.0" encoding="utf-8"?>
-<w:settings xmlns:mc="http://schemas.openxmlformats.org/markup-compatibility/2006" xmlns:o="urn:schemas-microsoft-com:office:office" xmlns:r="http://schemas.openxmlformats.org/officeDocument/2006/relationships" xmlns:m="http://schemas.openxmlformats.org/officeDocument/2006/math" xmlns:v="urn:schemas-microsoft-com:vml" xmlns:w10="urn:schemas-microsoft-com:office:word" xmlns:w="http://schemas.openxmlformats.org/wordprocessingml/2006/main" xmlns:w14="http://schemas.microsoft.com/office/word/2010/wordml" xmlns:sl="http://schemas.openxmlformats.org/schemaLibrary/2006/main" xmlns:wpsCustomData="http://www.wps.cn/officeDocument/2013/wpsCustomData" mc:Ignorable="w14">
-  <w:zoom w:percent="107"/>
-  <w:documentProtection w:enforcement="0"/>
-  <w:defaultTabStop w:val="720"/>
-  <w:characterSpacingControl w:val="doNotCompress"/>
-  <w:footnotePr>
-    <w:footnote w:id="0"/>
-    <w:footnote w:id="1"/>
-  </w:footnotePr>
-  <w:endnotePr>
-    <w:endnote w:id="0"/>
-    <w:endnote w:id="1"/>
-  </w:endnotePr>
-  <w:compat>
-    <w:compatSetting w:name="compatibilityMode" w:uri="http://schemas.microsoft.com/office/word" w:val="14"/>
-    <w:compatSetting w:name="overrideTableStyleFontSizeAndJustification" w:uri="http://schemas.microsoft.com/office/word" w:val="1"/>
-    <w:compatSetting w:name="enableOpenTypeFeatures" w:uri="http://schemas.microsoft.com/office/word" w:val="1"/>
-    <w:compatSetting w:name="doNotFlipMirrorIndents" w:uri="http://schemas.microsoft.com/office/word" w:val="1"/>
-  </w:compat>
-  <w:rsids>
-    <w:rsidRoot w:val="000D586C"/>
-    <w:rsid w:val="0001107B"/>
-    <w:rsid w:val="000145B6"/>
-    <w:rsid w:val="000656DE"/>
-    <w:rsid w:val="0007079B"/>
-    <w:rsid w:val="00080BFB"/>
-    <w:rsid w:val="000A2DD2"/>
-    <w:rsid w:val="000A3C9A"/>
-    <w:rsid w:val="000B0DB6"/>
-    <w:rsid w:val="000B5451"/>
-    <w:rsid w:val="000D586C"/>
-    <w:rsid w:val="000E4AE9"/>
-    <w:rsid w:val="001200C6"/>
-    <w:rsid w:val="00152073"/>
-    <w:rsid w:val="001525C3"/>
-    <w:rsid w:val="00165061"/>
-    <w:rsid w:val="001968C1"/>
-    <w:rsid w:val="001B0309"/>
-    <w:rsid w:val="001D18FB"/>
-    <w:rsid w:val="001D7CDF"/>
-    <w:rsid w:val="001E0DF5"/>
-    <w:rsid w:val="001F0B61"/>
-    <w:rsid w:val="0022715C"/>
-    <w:rsid w:val="00243F2B"/>
-    <w:rsid w:val="002468A3"/>
-    <w:rsid w:val="0028334F"/>
-    <w:rsid w:val="00293481"/>
-    <w:rsid w:val="002B1A33"/>
-    <w:rsid w:val="002B2AFD"/>
-    <w:rsid w:val="002C24FE"/>
-    <w:rsid w:val="002D26E8"/>
-    <w:rsid w:val="002E1AED"/>
-    <w:rsid w:val="003053DA"/>
-    <w:rsid w:val="0030791A"/>
-    <w:rsid w:val="00315680"/>
-    <w:rsid w:val="00317AEB"/>
-    <w:rsid w:val="003253CE"/>
-    <w:rsid w:val="00333FE7"/>
-    <w:rsid w:val="0033463C"/>
-    <w:rsid w:val="00357E4E"/>
-    <w:rsid w:val="00360CF6"/>
-    <w:rsid w:val="003A3D2C"/>
-    <w:rsid w:val="003A7EBA"/>
-    <w:rsid w:val="003E706D"/>
-    <w:rsid w:val="004035FB"/>
-    <w:rsid w:val="00404AD1"/>
-    <w:rsid w:val="004152FA"/>
-    <w:rsid w:val="004765D7"/>
-    <w:rsid w:val="00486678"/>
-    <w:rsid w:val="004B4EF1"/>
-    <w:rsid w:val="004D5CC3"/>
-    <w:rsid w:val="00517932"/>
-    <w:rsid w:val="00540AC0"/>
-    <w:rsid w:val="005920E2"/>
-    <w:rsid w:val="005B34DD"/>
-    <w:rsid w:val="005C01FD"/>
-    <w:rsid w:val="005C31B2"/>
-    <w:rsid w:val="005C4639"/>
-    <w:rsid w:val="005E24CC"/>
-    <w:rsid w:val="005F3444"/>
-    <w:rsid w:val="006632AD"/>
-    <w:rsid w:val="00691470"/>
-    <w:rsid w:val="006A75DC"/>
-    <w:rsid w:val="006B1658"/>
-    <w:rsid w:val="006B1C6A"/>
-    <w:rsid w:val="006B47E8"/>
-    <w:rsid w:val="006C547E"/>
-    <w:rsid w:val="006C7597"/>
-    <w:rsid w:val="006F0533"/>
-    <w:rsid w:val="00713152"/>
-    <w:rsid w:val="00720777"/>
-    <w:rsid w:val="00742E79"/>
-    <w:rsid w:val="007539C4"/>
-    <w:rsid w:val="0075479D"/>
-    <w:rsid w:val="00757732"/>
-    <w:rsid w:val="0076761D"/>
-    <w:rsid w:val="00790D45"/>
-    <w:rsid w:val="007A1533"/>
-    <w:rsid w:val="007A3E65"/>
-    <w:rsid w:val="007C56FE"/>
-    <w:rsid w:val="0080174B"/>
-    <w:rsid w:val="00806FA1"/>
-    <w:rsid w:val="008369AA"/>
-    <w:rsid w:val="00854B79"/>
-    <w:rsid w:val="00877359"/>
-    <w:rsid w:val="008949CC"/>
-    <w:rsid w:val="008A2507"/>
-    <w:rsid w:val="008B2F13"/>
-    <w:rsid w:val="008C28C5"/>
-    <w:rsid w:val="008D042E"/>
-    <w:rsid w:val="008D4077"/>
-    <w:rsid w:val="009062E7"/>
-    <w:rsid w:val="00906418"/>
-    <w:rsid w:val="009357D3"/>
-    <w:rsid w:val="00935A48"/>
-    <w:rsid w:val="009957F3"/>
-    <w:rsid w:val="009A1FB7"/>
-    <w:rsid w:val="009A649E"/>
-    <w:rsid w:val="009C4B61"/>
-    <w:rsid w:val="009D4801"/>
-    <w:rsid w:val="009E70FA"/>
-    <w:rsid w:val="00A014AE"/>
-    <w:rsid w:val="00A15489"/>
-    <w:rsid w:val="00A32E78"/>
-    <w:rsid w:val="00A47597"/>
-    <w:rsid w:val="00A5335F"/>
-    <w:rsid w:val="00A54822"/>
-    <w:rsid w:val="00A57845"/>
-    <w:rsid w:val="00A608BD"/>
-    <w:rsid w:val="00A6705D"/>
-    <w:rsid w:val="00A90B6C"/>
-    <w:rsid w:val="00AA6859"/>
-    <w:rsid w:val="00AB11A2"/>
-    <w:rsid w:val="00AB5AE5"/>
-    <w:rsid w:val="00AD5BAA"/>
-    <w:rsid w:val="00AE3431"/>
-    <w:rsid w:val="00B36C22"/>
-    <w:rsid w:val="00B56B3F"/>
-    <w:rsid w:val="00B73F23"/>
-    <w:rsid w:val="00BA1869"/>
-    <w:rsid w:val="00BD195C"/>
-    <w:rsid w:val="00BF2C30"/>
-    <w:rsid w:val="00BF520A"/>
-    <w:rsid w:val="00C1266D"/>
-    <w:rsid w:val="00C31CE3"/>
-    <w:rsid w:val="00C3786E"/>
-    <w:rsid w:val="00C5196C"/>
-    <w:rsid w:val="00C56A13"/>
-    <w:rsid w:val="00C6766F"/>
-    <w:rsid w:val="00CD19A5"/>
-    <w:rsid w:val="00CE18AE"/>
-    <w:rsid w:val="00CE709E"/>
-    <w:rsid w:val="00D1561A"/>
-    <w:rsid w:val="00D1634A"/>
-    <w:rsid w:val="00D845CD"/>
-    <w:rsid w:val="00DC4299"/>
-    <w:rsid w:val="00DD1863"/>
-    <w:rsid w:val="00E1055E"/>
-    <w:rsid w:val="00E16312"/>
-    <w:rsid w:val="00E6612F"/>
-    <w:rsid w:val="00E72588"/>
-    <w:rsid w:val="00E81D59"/>
-    <w:rsid w:val="00E93423"/>
-    <w:rsid w:val="00EA26DA"/>
-    <w:rsid w:val="00EC553E"/>
-    <w:rsid w:val="00ED780B"/>
-    <w:rsid w:val="00EE1372"/>
-    <w:rsid w:val="00EF0831"/>
-    <w:rsid w:val="00EF670E"/>
-    <w:rsid w:val="00F053FB"/>
-    <w:rsid w:val="00F25CA4"/>
-    <w:rsid w:val="00F25CFA"/>
-    <w:rsid w:val="00F35F06"/>
-    <w:rsid w:val="00F40C73"/>
-    <w:rsid w:val="00F4505A"/>
-    <w:rsid w:val="00F61424"/>
-    <w:rsid w:val="00F833CE"/>
-    <w:rsid w:val="00FA5315"/>
-    <w:rsid w:val="00FC4492"/>
-    <w:rsid w:val="00FC72A7"/>
-    <w:rsid w:val="00FE6CA9"/>
-    <w:rsid w:val="00FF0DB5"/>
-    <w:rsid w:val="29615EC0"/>
-  </w:rsids>
-  <m:mathPr>
-    <m:mathFont m:val="Cambria Math"/>
-    <m:brkBin m:val="before"/>
-    <m:brkBinSub m:val="--"/>
-    <m:smallFrac m:val="1"/>
-    <m:dispDef/>
-    <m:lMargin m:val="0"/>
-    <m:rMargin m:val="0"/>
-    <m:defJc m:val="centerGroup"/>
-    <m:wrapIndent m:val="1440"/>
-    <m:intLim m:val="subSup"/>
-    <m:naryLim m:val="undOvr"/>
-  </m:mathPr>
-  <w:themeFontLang w:val="en-US" w:eastAsia="zh-CN"/>
-  <w:clrSchemeMapping w:bg1="light1" w:t1="dark1" w:bg2="light2" w:t2="dark2" w:accent1="accent1" w:accent2="accent2" w:accent3="accent3" w:accent4="accent4" w:accent5="accent5" w:accent6="accent6" w:hyperlink="hyperlink" w:followedHyperlink="followedHyperlink"/>
-  <w:shapeDefaults>
-    <o:shapedefaults fillcolor="#FFFFFF" fill="t" stroke="t">
-      <v:fill on="t" focussize="0,0"/>
-      <v:stroke color="#000000"/>
-    </o:shapedefaults>
-    <o:shapelayout v:ext="edit">
-      <o:idmap v:ext="edit" data="1"/>
-    </o:shapelayout>
-  </w:shapeDefaults>
-</w:settings>
-</file>
-
-<file path=word\styles.xml><?xml version="1.0" encoding="utf-8"?>
+<file path=word/styles.xml><?xml version="1.0" encoding="utf-8"?>
 <w:styles xmlns:mc="http://schemas.openxmlformats.org/markup-compatibility/2006" xmlns:o="urn:schemas-microsoft-com:office:office" xmlns:r="http://schemas.openxmlformats.org/officeDocument/2006/relationships" xmlns:m="http://schemas.openxmlformats.org/officeDocument/2006/math" xmlns:v="urn:schemas-microsoft-com:vml" xmlns:w="http://schemas.openxmlformats.org/wordprocessingml/2006/main" xmlns:w14="http://schemas.microsoft.com/office/word/2010/wordml" xmlns:w10="urn:schemas-microsoft-com:office:word" xmlns:sl="http://schemas.openxmlformats.org/schemaLibrary/2006/main" xmlns:wpsCustomData="http://www.wps.cn/officeDocument/2013/wpsCustomData" mc:Ignorable="w14">
   <w:docDefaults>
     <w:rPrDefault>
@@ -4427,7 +4057,7 @@
 </w:styles>
 </file>
 
-<file path=word\theme\theme1.xml><?xml version="1.0" encoding="utf-8"?>
+<file path=word/theme/theme1.xml><?xml version="1.0" encoding="utf-8"?>
 <a:theme xmlns:a="http://schemas.openxmlformats.org/drawingml/2006/main" name="Office Theme">
   <a:themeElements>
     <a:clrScheme name="Office">
@@ -4709,4 +4339,31 @@
   </a:themeElements>
   <a:objectDefaults/>
 </a:theme>
+</file>
+
+<file path=customXml/item1.xml><?xml version="1.0" encoding="utf-8"?>
+<s:customData xmlns="http://www.wps.cn/officeDocument/2013/wpsCustomData" xmlns:s="http://www.wps.cn/officeDocument/2013/wpsCustomData">
+  <customSectProps/>
+  <customShpExts>
+    <customShpInfo spid="_x0000_s1026" textRotate="1"/>
+  </customShpExts>
+</s:customData>
+</file>
+
+<file path=customXml/item2.xml><?xml version="1.0" encoding="utf-8"?>
+<b:Sources xmlns:b="http://schemas.openxmlformats.org/officeDocument/2006/bibliography" xmlns="http://schemas.openxmlformats.org/officeDocument/2006/bibliography" SelectedStyle="\APA.XSL" StyleName="APA"/>
+</file>
+
+<file path=customXml/itemProps1.xml><?xml version="1.0" encoding="utf-8"?>
+<ds:datastoreItem xmlns:ds="http://schemas.openxmlformats.org/officeDocument/2006/customXml" ds:itemID="{B1977F7D-205B-4081-913C-38D41E755F92}">
+  <ds:schemaRefs>
+    <ds:schemaRef ds:uri="http://www.wps.cn/officeDocument/2013/wpsCustomData"/>
+  </ds:schemaRefs>
+</ds:datastoreItem>
+</file>
+
+<file path=customXml/itemProps2.xml><?xml version="1.0" encoding="utf-8"?>
+<ds:datastoreItem xmlns:ds="http://schemas.openxmlformats.org/officeDocument/2006/customXml" ds:itemID="{8044BF1E-8A55-4C67-8D7C-874AF00BACAA}">
+  <ds:schemaRefs/>
+</ds:datastoreItem>
 </file>
</xml_diff>